<commit_message>
Block-based catalog, per-work access codes and revised report templates
- Replace semester wording with Блок 1/Блок 2 on the catalog and work pages
- Drop SA11 and renumber SA12-SA30 to SA11-SA29: 29 subject areas in 6 groups
- Show work codes МДК.06.02-ЛР01…ЛР12 and remove points from the site
- Remove LMS submission, the materials button and the pre-class settings dialog
- Recommend Фамилия_Группа_МДК0602_ЛРNN.docx as the report file name
- Move work navigation under the cards and add the previous-work link
- Require a code per work: only SHA-256 hashes are published, access lasts a week
- Rebuild the 12 DOCX report forms from the updated reference templates
</commit_message>
<xml_diff>
--- a/public/reports/S7_LR01_template.docx
+++ b/public/reports/S7_LR01_template.docx
@@ -1,87 +1,134 @@
 
 <file path=word/document.xml><?xml version="1.0" encoding="utf-8"?>
-<w:document xmlns:wpc="http://schemas.microsoft.com/office/word/2010/wordprocessingCanvas" xmlns:cx="http://schemas.microsoft.com/office/drawing/2014/chartex" xmlns:cx1="http://schemas.microsoft.com/office/drawing/2015/9/8/chartex" xmlns:cx2="http://schemas.microsoft.com/office/drawing/2015/10/21/chartex" xmlns:cx3="http://schemas.microsoft.com/office/drawing/2016/5/9/chartex" xmlns:cx4="http://schemas.microsoft.com/office/drawing/2016/5/10/chartex" xmlns:cx5="http://schemas.microsoft.com/office/drawing/2016/5/11/chartex" xmlns:cx6="http://schemas.microsoft.com/office/drawing/2016/5/12/chartex" xmlns:cx7="http://schemas.microsoft.com/office/drawing/2016/5/13/chartex" xmlns:cx8="http://schemas.microsoft.com/office/drawing/2016/5/14/chartex" xmlns:mc="http://schemas.openxmlformats.org/markup-compatibility/2006" xmlns:aink="http://schemas.microsoft.com/office/drawing/2016/ink" xmlns:am3d="http://schemas.microsoft.com/office/drawing/2017/model3d" xmlns:o="urn:schemas-microsoft-com:office:office" xmlns:r="http://schemas.openxmlformats.org/officeDocument/2006/relationships" xmlns:m="http://schemas.openxmlformats.org/officeDocument/2006/math" xmlns:v="urn:schemas-microsoft-com:vml" xmlns:wp14="http://schemas.microsoft.com/office/word/2010/wordprocessingDrawing" xmlns:wp="http://schemas.openxmlformats.org/drawingml/2006/wordprocessingDrawing" xmlns:w10="urn:schemas-microsoft-com:office:word" xmlns:w="http://schemas.openxmlformats.org/wordprocessingml/2006/main" xmlns:w14="http://schemas.microsoft.com/office/word/2010/wordml" xmlns:w15="http://schemas.microsoft.com/office/word/2012/wordml" xmlns:w16cex="http://schemas.microsoft.com/office/word/2018/wordml/cex" xmlns:w16cid="http://schemas.microsoft.com/office/word/2016/wordml/cid" xmlns:w16="http://schemas.microsoft.com/office/word/2018/wordml" xmlns:w16sdtdh="http://schemas.microsoft.com/office/word/2020/wordml/sdtdatahash" xmlns:w16se="http://schemas.microsoft.com/office/word/2015/wordml/symex" xmlns:wpg="http://schemas.microsoft.com/office/word/2010/wordprocessingGroup" xmlns:wpi="http://schemas.microsoft.com/office/word/2010/wordprocessingInk" xmlns:wne="http://schemas.microsoft.com/office/word/2006/wordml" xmlns:wps="http://schemas.microsoft.com/office/word/2010/wordprocessingShape" mc:Ignorable="w14 w15 w16se w16cid w16 w16cex w16sdtdh wp14">
+<w:document xmlns:wpc="http://schemas.microsoft.com/office/word/2010/wordprocessingCanvas" xmlns:cx="http://schemas.microsoft.com/office/drawing/2014/chartex" xmlns:mc="http://schemas.openxmlformats.org/markup-compatibility/2006" xmlns:o="urn:schemas-microsoft-com:office:office" xmlns:r="http://schemas.openxmlformats.org/officeDocument/2006/relationships" xmlns:m="http://schemas.openxmlformats.org/officeDocument/2006/math" xmlns:v="urn:schemas-microsoft-com:vml" xmlns:wp14="http://schemas.microsoft.com/office/word/2010/wordprocessingDrawing" xmlns:wp="http://schemas.openxmlformats.org/drawingml/2006/wordprocessingDrawing" xmlns:w10="urn:schemas-microsoft-com:office:word" xmlns:w="http://schemas.openxmlformats.org/wordprocessingml/2006/main" xmlns:w14="http://schemas.microsoft.com/office/word/2010/wordml" xmlns:w15="http://schemas.microsoft.com/office/word/2012/wordml" xmlns:w16se="http://schemas.microsoft.com/office/word/2015/wordml/symex" xmlns:wpg="http://schemas.microsoft.com/office/word/2010/wordprocessingGroup" xmlns:wpi="http://schemas.microsoft.com/office/word/2010/wordprocessingInk" xmlns:wne="http://schemas.microsoft.com/office/word/2006/wordml" xmlns:wps="http://schemas.microsoft.com/office/word/2010/wordprocessingShape" mc:Ignorable="w14 w15 w16se wp14">
   <w:body>
     <w:p>
       <w:pPr>
-        <w:ind w:right="-850" w:hanging="1701"/>
+        <w:pStyle w:val="afc"/>
+        <w:jc w:val="center"/>
+        <w:rPr>
+          <w:color w:val="0F1115"/>
+          <w:sz w:val="24"/>
+          <w:szCs w:val="24"/>
+          <w:shd w:val="clear" w:color="auto" w:fill="FFFFFF"/>
+        </w:rPr>
       </w:pPr>
       <w:r>
         <w:rPr>
-          <w:noProof/>
-          <w:lang w:eastAsia="ru-RU"/>
+          <w:rStyle w:val="afd"/>
+          <w:rFonts w:eastAsia="Arial"/>
+          <w:color w:val="0F1115"/>
+          <w:sz w:val="24"/>
+          <w:szCs w:val="24"/>
+          <w:shd w:val="clear" w:color="auto" w:fill="FFFFFF"/>
+        </w:rPr>
+        <w:t>Г</w:t>
+      </w:r>
+      <w:r>
+        <w:rPr>
+          <w:rStyle w:val="afd"/>
+          <w:rFonts w:eastAsia="Arial"/>
+          <w:color w:val="0F1115"/>
+          <w:sz w:val="24"/>
+          <w:szCs w:val="24"/>
+          <w:shd w:val="clear" w:color="auto" w:fill="FFFFFF"/>
+        </w:rPr>
+        <w:t>ОСУДАРСТВЕННОЕ АВТОНОМНОЕ ПРОФЕССИОНАЛЬНОЕ ОБРАЗОВАТЕЛЬНОЕ УЧРЕЖДЕНИЕ СВЕРДЛОВСКОЙ ОБЛАСТИ</w:t>
+      </w:r>
+      <w:r>
+        <w:rPr>
+          <w:rStyle w:val="a7"/>
+          <w:color w:val="0F1115"/>
+          <w:sz w:val="24"/>
+          <w:szCs w:val="24"/>
+          <w:shd w:val="clear" w:color="auto" w:fill="FFFFFF"/>
+        </w:rPr>
+        <w:t xml:space="preserve"> </w:t>
+      </w:r>
+      <w:r>
+        <w:rPr>
+          <w:b/>
+          <w:color w:val="0F1115"/>
+          <w:sz w:val="24"/>
+          <w:szCs w:val="24"/>
+          <w:shd w:val="clear" w:color="auto" w:fill="FFFFFF"/>
+        </w:rPr>
+        <w:t>«</w:t>
+      </w:r>
+      <w:r>
+        <w:rPr>
+          <w:b/>
+          <w:color w:val="0F1115"/>
+          <w:sz w:val="24"/>
+          <w:szCs w:val="24"/>
+          <w:shd w:val="clear" w:color="auto" w:fill="FFFFFF"/>
+        </w:rPr>
+        <w:t>БЕРЁЗОВСКИЙ</w:t>
+      </w:r>
+      <w:r>
+        <w:rPr>
+          <w:b/>
+          <w:color w:val="0F1115"/>
+          <w:sz w:val="24"/>
+          <w:szCs w:val="24"/>
+          <w:shd w:val="clear" w:color="auto" w:fill="FFFFFF"/>
+        </w:rPr>
+        <w:t xml:space="preserve"> </w:t>
+      </w:r>
+      <w:r>
+        <w:rPr>
+          <w:b/>
+          <w:color w:val="0F1115"/>
+          <w:sz w:val="24"/>
+          <w:szCs w:val="24"/>
+          <w:shd w:val="clear" w:color="auto" w:fill="FFFFFF"/>
+        </w:rPr>
+        <w:t>ТЕХНИКУМ</w:t>
+      </w:r>
+      <w:r>
+        <w:rPr>
+          <w:b/>
+          <w:color w:val="0F1115"/>
+          <w:sz w:val="24"/>
+          <w:szCs w:val="24"/>
+          <w:shd w:val="clear" w:color="auto" w:fill="FFFFFF"/>
+        </w:rPr>
+        <w:t xml:space="preserve"> «</w:t>
+      </w:r>
+      <w:r>
+        <w:rPr>
+          <w:b/>
+          <w:color w:val="0F1115"/>
+          <w:sz w:val="24"/>
+          <w:szCs w:val="24"/>
+          <w:shd w:val="clear" w:color="auto" w:fill="FFFFFF"/>
+        </w:rPr>
+        <w:t>ПРОФИ</w:t>
+      </w:r>
+      <w:r>
+        <w:rPr>
+          <w:b/>
+          <w:color w:val="0F1115"/>
+          <w:sz w:val="24"/>
+          <w:szCs w:val="24"/>
+          <w:shd w:val="clear" w:color="auto" w:fill="FFFFFF"/>
+        </w:rPr>
+        <w:t>»</w:t>
+      </w:r>
+    </w:p>
+    <w:p>
+      <w:pPr>
+        <w:spacing w:after="0"/>
+        <w:ind w:right="-1"/>
+        <w:rPr>
+          <w:rFonts w:ascii="TimesNewRomanPS-BoldMT" w:hAnsi="TimesNewRomanPS-BoldMT"/>
+          <w:b/>
+          <w:bCs/>
+          <w:color w:val="000000"/>
           <w:sz w:val="24"/>
           <w:szCs w:val="24"/>
         </w:rPr>
-        <mc:AlternateContent>
-          <mc:Choice Requires="wpg">
-            <w:drawing>
-              <wp:inline distT="0" distB="0" distL="0" distR="0" wp14:anchorId="3949C3CE" wp14:editId="5DE9960B">
-                <wp:extent cx="7574280" cy="914400"/>
-                <wp:effectExtent l="0" t="0" r="7620" b="0"/>
-                <wp:docPr id="1" name="Рисунок 1" descr="Логотип Университета Синергия" title="Фирменный знак"/>
-                <wp:cNvGraphicFramePr>
-                  <a:graphicFrameLocks xmlns:a="http://schemas.openxmlformats.org/drawingml/2006/main" noChangeAspect="1"/>
-                </wp:cNvGraphicFramePr>
-                <a:graphic xmlns:a="http://schemas.openxmlformats.org/drawingml/2006/main">
-                  <a:graphicData uri="http://schemas.openxmlformats.org/drawingml/2006/picture">
-                    <pic:pic xmlns:pic="http://schemas.openxmlformats.org/drawingml/2006/picture">
-                      <pic:nvPicPr>
-                        <pic:cNvPr id="0" name="Рисунок 1" descr="Фирменный знак учебного практикума" title="Фирменный знак"/>
-                        <pic:cNvPicPr>
-                          <a:picLocks noChangeAspect="1"/>
-                        </pic:cNvPicPr>
-                      </pic:nvPicPr>
-                      <pic:blipFill>
-                        <a:blip r:embed="rId6"/>
-                        <a:stretch/>
-                      </pic:blipFill>
-                      <pic:spPr bwMode="auto">
-                        <a:xfrm>
-                          <a:off x="0" y="0"/>
-                          <a:ext cx="7574280" cy="914400"/>
-                        </a:xfrm>
-                        <a:prstGeom prst="rect">
-                          <a:avLst/>
-                        </a:prstGeom>
-                        <a:noFill/>
-                        <a:ln>
-                          <a:noFill/>
-                          <a:miter/>
-                        </a:ln>
-                      </pic:spPr>
-                    </pic:pic>
-                  </a:graphicData>
-                </a:graphic>
-              </wp:inline>
-            </w:drawing>
-          </mc:Choice>
-          <mc:Fallback xmlns:a="http://schemas.openxmlformats.org/drawingml/2006/main">
-            <w:pict>
-              <v:shapetype type="#_x0000_t75" o:spt="75" coordsize="21600,21600" o:preferrelative="t" path="m@4@5l@4@11@9@11@9@5xe">
-                <v:formulas>
-                  <v:f eqn="if lineDrawn pixelLineWidth 0"/>
-                  <v:f eqn="sum @0 1 0"/>
-                  <v:f eqn="sum 0 0 @1"/>
-                  <v:f eqn="prod @2 1 2"/>
-                  <v:f eqn="prod @3 21600 pixelWidth"/>
-                  <v:f eqn="prod @3 21600 pixelHeight"/>
-                  <v:f eqn="sum @0 0 1"/>
-                  <v:f eqn="prod @6 1 2"/>
-                  <v:f eqn="prod @7 21600 pixelWidth"/>
-                  <v:f eqn="sum @8 21600 0"/>
-                  <v:f eqn="prod @7 21600 pixelHeight"/>
-                  <v:f eqn="sum @10 21600 0"/>
-                </v:formulas>
-              </v:shapetype>
-              <v:shape id="_x0000_i0" o:spid="_x0000_s0" type="#_x0000_t75" style="width:596.40pt;height:72.00pt;mso-wrap-distance-left:0.00pt;mso-wrap-distance-top:0.00pt;mso-wrap-distance-right:0.00pt;mso-wrap-distance-bottom:0.00pt;" stroked="f">
-                <v:path textboxrect="0,0,0,0"/>
-                <v:imagedata r:id="rId8" o:title=""/>
-              </v:shape>
-            </w:pict>
-          </mc:Fallback>
-        </mc:AlternateContent>
-      </w:r>
+      </w:pPr>
     </w:p>
     <w:p>
       <w:pPr>
@@ -97,69 +144,6 @@
           <w:szCs w:val="24"/>
         </w:rPr>
       </w:pPr>
-      <w:r>
-        <w:rPr>
-          <w:rFonts w:ascii="TimesNewRomanPS-BoldMT" w:hAnsi="TimesNewRomanPS-BoldMT"/>
-          <w:b/>
-          <w:bCs/>
-          <w:color w:val="000000"/>
-          <w:sz w:val="24"/>
-          <w:szCs w:val="24"/>
-        </w:rPr>
-        <w:t xml:space="preserve">АВТОНОМНАЯ НЕКОММЕРЧЕСКАЯ ОРГАНИЗАЦИЯ</w:t>
-      </w:r>
-    </w:p>
-    <w:p>
-      <w:pPr>
-        <w:spacing w:after="0"/>
-        <w:ind w:right="-1"/>
-        <w:jc w:val="center"/>
-        <w:rPr>
-          <w:rFonts w:ascii="TimesNewRomanPS-BoldMT" w:hAnsi="TimesNewRomanPS-BoldMT"/>
-          <w:b/>
-          <w:bCs/>
-          <w:color w:val="000000"/>
-          <w:sz w:val="24"/>
-          <w:szCs w:val="24"/>
-        </w:rPr>
-      </w:pPr>
-      <w:r>
-        <w:rPr>
-          <w:rFonts w:ascii="TimesNewRomanPS-BoldMT" w:hAnsi="TimesNewRomanPS-BoldMT"/>
-          <w:b/>
-          <w:bCs/>
-          <w:color w:val="000000"/>
-          <w:sz w:val="24"/>
-          <w:szCs w:val="24"/>
-        </w:rPr>
-        <w:t xml:space="preserve"> ВЫСШЕГО ОБРАЗОВАНИЯ</w:t>
-      </w:r>
-    </w:p>
-    <w:p>
-      <w:pPr>
-        <w:spacing w:after="0"/>
-        <w:ind w:right="-1"/>
-        <w:jc w:val="center"/>
-        <w:rPr>
-          <w:rFonts w:ascii="TimesNewRomanPS-BoldMT" w:hAnsi="TimesNewRomanPS-BoldMT"/>
-          <w:b/>
-          <w:bCs/>
-          <w:color w:val="000000"/>
-          <w:sz w:val="24"/>
-          <w:szCs w:val="24"/>
-        </w:rPr>
-      </w:pPr>
-      <w:r>
-        <w:rPr>
-          <w:rFonts w:ascii="TimesNewRomanPS-BoldMT" w:hAnsi="TimesNewRomanPS-BoldMT"/>
-          <w:b/>
-          <w:bCs/>
-          <w:color w:val="000000"/>
-          <w:sz w:val="24"/>
-          <w:szCs w:val="24"/>
-        </w:rPr>
-        <w:t xml:space="preserve">«МОСКОВСКИЙ УНИВЕРСИТЕТ «СИНЕРГИЯ» </w:t>
-      </w:r>
     </w:p>
     <w:tbl>
       <w:tblPr>
@@ -171,161 +155,6 @@
         <w:gridCol w:w="282"/>
         <w:gridCol w:w="5948"/>
       </w:tblGrid>
-      <w:tr>
-        <w:tc>
-          <w:tcPr>
-            <w:tcW w:w="3115" w:type="dxa"/>
-            <w:shd w:val="clear" w:color="auto" w:fill="auto"/>
-          </w:tcPr>
-          <w:p>
-            <w:pPr>
-              <w:spacing w:after="0" w:line="240" w:lineRule="auto"/>
-              <w:ind w:right="-1"/>
-              <w:jc w:val="center"/>
-              <w:rPr>
-                <w:rFonts w:ascii="TimesNewRomanPS-BoldMT" w:hAnsi="TimesNewRomanPS-BoldMT"/>
-                <w:color w:val="000000"/>
-                <w:sz w:val="24"/>
-                <w:szCs w:val="24"/>
-              </w:rPr>
-            </w:pPr>
-            <w:r>
-              <w:rPr>
-                <w:rFonts w:ascii="TimesNewRomanPS-BoldMT" w:hAnsi="TimesNewRomanPS-BoldMT"/>
-                <w:b/>
-                <w:bCs/>
-                <w:color w:val="000000"/>
-                <w:sz w:val="24"/>
-                <w:szCs w:val="24"/>
-              </w:rPr>
-              <w:t>Факультет/Институт</w:t>
-            </w:r>
-          </w:p>
-        </w:tc>
-        <w:tc>
-          <w:tcPr>
-            <w:tcW w:w="282" w:type="dxa"/>
-            <w:shd w:val="clear" w:color="auto" w:fill="auto"/>
-          </w:tcPr>
-          <w:p>
-            <w:pPr>
-              <w:spacing w:after="0" w:line="240" w:lineRule="auto"/>
-              <w:ind w:right="-1"/>
-              <w:jc w:val="center"/>
-              <w:rPr>
-                <w:rFonts w:ascii="TimesNewRomanPS-BoldMT" w:hAnsi="TimesNewRomanPS-BoldMT"/>
-                <w:color w:val="000000"/>
-                <w:sz w:val="24"/>
-                <w:szCs w:val="24"/>
-              </w:rPr>
-            </w:pPr>
-          </w:p>
-        </w:tc>
-        <w:tc>
-          <w:tcPr>
-            <w:tcW w:w="5948" w:type="dxa"/>
-            <w:tcBorders>
-              <w:bottom w:val="single" w:sz="4" w:space="0" w:color="000000"/>
-            </w:tcBorders>
-            <w:shd w:val="clear" w:color="auto" w:fill="auto"/>
-          </w:tcPr>
-          <w:p>
-            <w:pPr>
-              <w:spacing w:after="0" w:line="240" w:lineRule="auto"/>
-              <w:ind w:right="-1"/>
-              <w:jc w:val="center"/>
-              <w:rPr>
-                <w:rFonts w:ascii="Times New Roman" w:hAnsi="Times New Roman"/>
-                <w:color w:val="000000"/>
-                <w:sz w:val="24"/>
-                <w:szCs w:val="24"/>
-              </w:rPr>
-            </w:pPr>
-            <w:r>
-              <w:rPr>
-                <w:rFonts w:ascii="Times New Roman" w:hAnsi="Times New Roman"/>
-                <w:color w:val="000000"/>
-                <w:sz w:val="24"/>
-                <w:szCs w:val="24"/>
-              </w:rPr>
-              <w:t>Информационных технологий</w:t>
-            </w:r>
-          </w:p>
-        </w:tc>
-      </w:tr>
-      <w:tr>
-        <w:tc>
-          <w:tcPr>
-            <w:tcW w:w="3115" w:type="dxa"/>
-            <w:shd w:val="clear" w:color="auto" w:fill="auto"/>
-          </w:tcPr>
-          <w:p>
-            <w:pPr>
-              <w:spacing w:after="0" w:line="240" w:lineRule="auto"/>
-              <w:ind w:right="-1"/>
-              <w:jc w:val="center"/>
-              <w:rPr>
-                <w:rFonts w:ascii="TimesNewRomanPS-BoldMT" w:hAnsi="TimesNewRomanPS-BoldMT"/>
-                <w:b/>
-                <w:bCs/>
-                <w:color w:val="000000"/>
-                <w:sz w:val="24"/>
-                <w:szCs w:val="24"/>
-              </w:rPr>
-            </w:pPr>
-          </w:p>
-        </w:tc>
-        <w:tc>
-          <w:tcPr>
-            <w:tcW w:w="282" w:type="dxa"/>
-            <w:shd w:val="clear" w:color="auto" w:fill="auto"/>
-          </w:tcPr>
-          <w:p>
-            <w:pPr>
-              <w:spacing w:after="0" w:line="240" w:lineRule="auto"/>
-              <w:ind w:right="-1"/>
-              <w:jc w:val="center"/>
-              <w:rPr>
-                <w:rFonts w:ascii="TimesNewRomanPS-BoldMT" w:hAnsi="TimesNewRomanPS-BoldMT"/>
-                <w:color w:val="000000"/>
-                <w:sz w:val="24"/>
-                <w:szCs w:val="24"/>
-              </w:rPr>
-            </w:pPr>
-          </w:p>
-        </w:tc>
-        <w:tc>
-          <w:tcPr>
-            <w:tcW w:w="5948" w:type="dxa"/>
-            <w:tcBorders>
-              <w:top w:val="single" w:sz="4" w:space="0" w:color="000000"/>
-            </w:tcBorders>
-            <w:shd w:val="clear" w:color="auto" w:fill="auto"/>
-          </w:tcPr>
-          <w:p>
-            <w:pPr>
-              <w:spacing w:after="0" w:line="240" w:lineRule="auto"/>
-              <w:ind w:right="-1"/>
-              <w:jc w:val="center"/>
-              <w:rPr>
-                <w:rFonts w:ascii="TimesNewRomanPS-BoldMT" w:hAnsi="TimesNewRomanPS-BoldMT"/>
-                <w:color w:val="000000"/>
-                <w:sz w:val="24"/>
-                <w:szCs w:val="24"/>
-              </w:rPr>
-            </w:pPr>
-            <w:r>
-              <w:rPr>
-                <w:rFonts w:ascii="TimesNewRomanPSMT" w:hAnsi="TimesNewRomanPSMT"/>
-                <w:color w:val="000000"/>
-                <w:sz w:val="24"/>
-                <w:szCs w:val="24"/>
-              </w:rPr>
-              <w:t>(наименование факультета/ Института)</w:t>
-            </w:r>
-          </w:p>
-        </w:tc>
-      </w:tr>
       <w:tr>
         <w:tc>
           <w:tcPr>
@@ -679,20 +508,6 @@
         </w:rPr>
         <w:t>.</w:t>
       </w:r>
-    </w:p>
-    <w:p>
-      <w:pPr>
-        <w:ind w:right="-1"/>
-        <w:jc w:val="center"/>
-        <w:rPr>
-          <w:rFonts w:ascii="TimesNewRomanPS-BoldMT" w:hAnsi="TimesNewRomanPS-BoldMT"/>
-          <w:b/>
-          <w:bCs/>
-          <w:color w:val="000000"/>
-          <w:sz w:val="24"/>
-          <w:szCs w:val="24"/>
-        </w:rPr>
-      </w:pPr>
       <w:r>
         <w:rPr>
           <w:rFonts w:ascii="TimesNewRomanPS-BoldMT" w:hAnsi="TimesNewRomanPS-BoldMT"/>
@@ -720,17 +535,7 @@
           <w:sz w:val="24"/>
           <w:szCs w:val="24"/>
         </w:rPr>
-        <w:t xml:space="preserve">Отчёт по лабораторной работе № 1</w:t>
-      </w:r>
-      <w:r>
-        <w:rPr>
-          <w:rFonts w:ascii="TimesNewRomanPS-BoldMT" w:hAnsi="TimesNewRomanPS-BoldMT"/>
-          <w:b/>
-          <w:bCs/>
-          <w:sz w:val="24"/>
-          <w:szCs w:val="24"/>
-        </w:rPr>
-        <w:t xml:space="preserve"/>
+        <w:t>Отчёт по лабораторной работе № 1</w:t>
       </w:r>
     </w:p>
     <w:tbl>
@@ -809,18 +614,27 @@
           </w:tcPr>
           <w:p>
             <w:pPr>
+              <w:keepLines/>
+              <w:spacing w:after="0" w:line="240" w:lineRule="auto"/>
               <w:jc w:val="center"/>
-              <w:spacing w:before="0" w:after="0" w:line="240" w:lineRule="auto"/>
-              <w:keepLines/>
             </w:pPr>
             <w:r>
               <w:rPr>
-                <w:rFonts w:ascii="Times New Roman" w:hAnsi="Times New Roman" w:eastAsia="Times New Roman" w:cs="Times New Roman"/>
+                <w:rFonts w:ascii="Times New Roman" w:eastAsia="Times New Roman" w:hAnsi="Times New Roman"/>
+                <w:color w:val="000000"/>
                 <w:sz w:val="24"/>
                 <w:szCs w:val="24"/>
+              </w:rPr>
+              <w:t xml:space="preserve">Разработка регламента работы службы поддержки информационной </w:t>
+            </w:r>
+            <w:r>
+              <w:rPr>
+                <w:rFonts w:ascii="Times New Roman" w:eastAsia="Times New Roman" w:hAnsi="Times New Roman"/>
                 <w:color w:val="000000"/>
+                <w:sz w:val="24"/>
+                <w:szCs w:val="24"/>
               </w:rPr>
-              <w:t>Разработка регламента работы службы поддержки информационной системы</w:t>
+              <w:t>системы</w:t>
             </w:r>
           </w:p>
         </w:tc>
@@ -1071,16 +885,16 @@
           </w:tcPr>
           <w:p>
             <w:pPr>
+              <w:keepLines/>
+              <w:spacing w:after="0" w:line="240" w:lineRule="auto"/>
               <w:jc w:val="center"/>
-              <w:spacing w:before="0" w:after="0" w:line="240" w:lineRule="auto"/>
-              <w:keepLines/>
             </w:pPr>
             <w:r>
               <w:rPr>
-                <w:rFonts w:ascii="Times New Roman" w:hAnsi="Times New Roman" w:eastAsia="Times New Roman" w:cs="Times New Roman"/>
+                <w:rFonts w:ascii="Times New Roman" w:eastAsia="Times New Roman" w:hAnsi="Times New Roman"/>
+                <w:color w:val="000000"/>
                 <w:sz w:val="24"/>
                 <w:szCs w:val="24"/>
-                <w:color w:val="000000"/>
               </w:rPr>
               <w:t>МДК.06.02 «Инженерно-техническая поддержка сопровождения информационных систем»</w:t>
             </w:r>
@@ -1370,7 +1184,6 @@
               </w:rPr>
               <w:t>(</w:t>
             </w:r>
-            <w:proofErr w:type="gramStart"/>
             <w:r>
               <w:rPr>
                 <w:rFonts w:ascii="TimesNewRomanPSMT" w:hAnsi="TimesNewRomanPSMT"/>
@@ -1378,17 +1191,7 @@
                 <w:sz w:val="24"/>
                 <w:szCs w:val="24"/>
               </w:rPr>
-              <w:t xml:space="preserve">ФИО)   </w:t>
-            </w:r>
-            <w:proofErr w:type="gramEnd"/>
-            <w:r>
-              <w:rPr>
-                <w:rFonts w:ascii="TimesNewRomanPSMT" w:hAnsi="TimesNewRomanPSMT"/>
-                <w:color w:val="000000"/>
-                <w:sz w:val="24"/>
-                <w:szCs w:val="24"/>
-              </w:rPr>
-              <w:t xml:space="preserve">                                                                              </w:t>
+              <w:t xml:space="preserve">ФИО)                                                                                 </w:t>
             </w:r>
           </w:p>
         </w:tc>
@@ -1734,7 +1537,6 @@
               </w:rPr>
               <w:t>(</w:t>
             </w:r>
-            <w:proofErr w:type="gramStart"/>
             <w:r>
               <w:rPr>
                 <w:rFonts w:ascii="TimesNewRomanPSMT" w:hAnsi="TimesNewRomanPSMT"/>
@@ -1742,17 +1544,7 @@
                 <w:sz w:val="24"/>
                 <w:szCs w:val="24"/>
               </w:rPr>
-              <w:t xml:space="preserve">ФИО)   </w:t>
-            </w:r>
-            <w:proofErr w:type="gramEnd"/>
-            <w:r>
-              <w:rPr>
-                <w:rFonts w:ascii="TimesNewRomanPSMT" w:hAnsi="TimesNewRomanPSMT"/>
-                <w:color w:val="000000"/>
-                <w:sz w:val="24"/>
-                <w:szCs w:val="24"/>
-              </w:rPr>
-              <w:t xml:space="preserve">                                                                              </w:t>
+              <w:t xml:space="preserve">ФИО)                                                                                 </w:t>
             </w:r>
           </w:p>
         </w:tc>
@@ -1818,6 +1610,73 @@
           <w:szCs w:val="24"/>
         </w:rPr>
       </w:pPr>
+    </w:p>
+    <w:p>
+      <w:pPr>
+        <w:jc w:val="center"/>
+        <w:rPr>
+          <w:rFonts w:ascii="TimesNewRomanPS-BoldMT" w:hAnsi="TimesNewRomanPS-BoldMT"/>
+          <w:b/>
+          <w:bCs/>
+          <w:color w:val="000000"/>
+          <w:sz w:val="24"/>
+          <w:szCs w:val="24"/>
+        </w:rPr>
+      </w:pPr>
+    </w:p>
+    <w:p>
+      <w:pPr>
+        <w:jc w:val="center"/>
+        <w:rPr>
+          <w:rFonts w:ascii="TimesNewRomanPS-BoldMT" w:hAnsi="TimesNewRomanPS-BoldMT"/>
+          <w:b/>
+          <w:bCs/>
+          <w:color w:val="000000"/>
+          <w:sz w:val="24"/>
+          <w:szCs w:val="24"/>
+        </w:rPr>
+      </w:pPr>
+    </w:p>
+    <w:p>
+      <w:pPr>
+        <w:jc w:val="center"/>
+        <w:rPr>
+          <w:rFonts w:ascii="TimesNewRomanPS-BoldMT" w:hAnsi="TimesNewRomanPS-BoldMT"/>
+          <w:b/>
+          <w:bCs/>
+          <w:color w:val="000000"/>
+          <w:sz w:val="24"/>
+          <w:szCs w:val="24"/>
+        </w:rPr>
+      </w:pPr>
+      <w:bookmarkStart w:id="1" w:name="_GoBack"/>
+      <w:bookmarkEnd w:id="1"/>
+    </w:p>
+    <w:p>
+      <w:pPr>
+        <w:jc w:val="center"/>
+        <w:rPr>
+          <w:rFonts w:ascii="TimesNewRomanPS-BoldMT" w:hAnsi="TimesNewRomanPS-BoldMT"/>
+          <w:b/>
+          <w:bCs/>
+          <w:color w:val="000000"/>
+          <w:sz w:val="24"/>
+          <w:szCs w:val="24"/>
+        </w:rPr>
+      </w:pPr>
+    </w:p>
+    <w:p>
+      <w:pPr>
+        <w:jc w:val="center"/>
+        <w:rPr>
+          <w:rFonts w:ascii="TimesNewRomanPS-BoldMT" w:hAnsi="TimesNewRomanPS-BoldMT"/>
+          <w:b/>
+          <w:bCs/>
+          <w:color w:val="000000"/>
+          <w:sz w:val="24"/>
+          <w:szCs w:val="24"/>
+        </w:rPr>
+      </w:pPr>
       <w:r>
         <w:rPr>
           <w:rFonts w:ascii="TimesNewRomanPS-BoldMT" w:hAnsi="TimesNewRomanPS-BoldMT"/>
@@ -1827,7 +1686,7 @@
           <w:sz w:val="24"/>
           <w:szCs w:val="24"/>
         </w:rPr>
-        <w:t xml:space="preserve">Москва, 2026</w:t>
+        <w:t>Берёзовский</w:t>
       </w:r>
       <w:r>
         <w:rPr>
@@ -1838,7 +1697,7 @@
           <w:sz w:val="24"/>
           <w:szCs w:val="24"/>
         </w:rPr>
-        <w:t/>
+        <w:t>, 2026</w:t>
       </w:r>
       <w:r>
         <w:rPr>
@@ -1883,7 +1742,21 @@
           <w:szCs w:val="24"/>
           <w:color w:val="000000"/>
         </w:rPr>
-        <w:t>Семестр 7 · ЛР 1 · Максимум 6 баллов</w:t>
+        <w:t>МДК.06.02-ЛР01</w:t>
+      </w:r>
+    </w:p>
+    <w:p>
+      <w:pPr>
+        <w:spacing w:before="0" w:after="110" w:line="276" w:lineRule="auto"/>
+      </w:pPr>
+      <w:r>
+        <w:rPr>
+          <w:rFonts w:ascii="Times New Roman" w:hAnsi="Times New Roman" w:eastAsia="Times New Roman" w:cs="Times New Roman"/>
+          <w:sz w:val="24"/>
+          <w:szCs w:val="24"/>
+          <w:color w:val="000000"/>
+        </w:rPr>
+        <w:t>Рекомендуемое имя файла: Фамилия_Группа_МДК0602_ЛР01.docx</w:t>
       </w:r>
     </w:p>
     <w:p>
@@ -4078,7 +3951,7 @@
 </file>
 
 <file path=word/endnotes.xml><?xml version="1.0" encoding="utf-8"?>
-<w:endnotes xmlns:wpc="http://schemas.microsoft.com/office/word/2010/wordprocessingCanvas" xmlns:cx="http://schemas.microsoft.com/office/drawing/2014/chartex" xmlns:cx1="http://schemas.microsoft.com/office/drawing/2015/9/8/chartex" xmlns:cx2="http://schemas.microsoft.com/office/drawing/2015/10/21/chartex" xmlns:cx3="http://schemas.microsoft.com/office/drawing/2016/5/9/chartex" xmlns:cx4="http://schemas.microsoft.com/office/drawing/2016/5/10/chartex" xmlns:cx5="http://schemas.microsoft.com/office/drawing/2016/5/11/chartex" xmlns:cx6="http://schemas.microsoft.com/office/drawing/2016/5/12/chartex" xmlns:cx7="http://schemas.microsoft.com/office/drawing/2016/5/13/chartex" xmlns:cx8="http://schemas.microsoft.com/office/drawing/2016/5/14/chartex" xmlns:mc="http://schemas.openxmlformats.org/markup-compatibility/2006" xmlns:aink="http://schemas.microsoft.com/office/drawing/2016/ink" xmlns:am3d="http://schemas.microsoft.com/office/drawing/2017/model3d" xmlns:o="urn:schemas-microsoft-com:office:office" xmlns:r="http://schemas.openxmlformats.org/officeDocument/2006/relationships" xmlns:m="http://schemas.openxmlformats.org/officeDocument/2006/math" xmlns:v="urn:schemas-microsoft-com:vml" xmlns:wp14="http://schemas.microsoft.com/office/word/2010/wordprocessingDrawing" xmlns:wp="http://schemas.openxmlformats.org/drawingml/2006/wordprocessingDrawing" xmlns:w10="urn:schemas-microsoft-com:office:word" xmlns:w="http://schemas.openxmlformats.org/wordprocessingml/2006/main" xmlns:w14="http://schemas.microsoft.com/office/word/2010/wordml" xmlns:w15="http://schemas.microsoft.com/office/word/2012/wordml" xmlns:w16cex="http://schemas.microsoft.com/office/word/2018/wordml/cex" xmlns:w16cid="http://schemas.microsoft.com/office/word/2016/wordml/cid" xmlns:w16="http://schemas.microsoft.com/office/word/2018/wordml" xmlns:w16sdtdh="http://schemas.microsoft.com/office/word/2020/wordml/sdtdatahash" xmlns:w16se="http://schemas.microsoft.com/office/word/2015/wordml/symex" xmlns:wpg="http://schemas.microsoft.com/office/word/2010/wordprocessingGroup" xmlns:wpi="http://schemas.microsoft.com/office/word/2010/wordprocessingInk" xmlns:wne="http://schemas.microsoft.com/office/word/2006/wordml" xmlns:wps="http://schemas.microsoft.com/office/word/2010/wordprocessingShape" mc:Ignorable="w14 w15 w16se w16cid w16 w16cex w16sdtdh wp14">
+<w:endnotes xmlns:wpc="http://schemas.microsoft.com/office/word/2010/wordprocessingCanvas" xmlns:cx="http://schemas.microsoft.com/office/drawing/2014/chartex" xmlns:mc="http://schemas.openxmlformats.org/markup-compatibility/2006" xmlns:o="urn:schemas-microsoft-com:office:office" xmlns:r="http://schemas.openxmlformats.org/officeDocument/2006/relationships" xmlns:m="http://schemas.openxmlformats.org/officeDocument/2006/math" xmlns:v="urn:schemas-microsoft-com:vml" xmlns:wp14="http://schemas.microsoft.com/office/word/2010/wordprocessingDrawing" xmlns:wp="http://schemas.openxmlformats.org/drawingml/2006/wordprocessingDrawing" xmlns:w10="urn:schemas-microsoft-com:office:word" xmlns:w="http://schemas.openxmlformats.org/wordprocessingml/2006/main" xmlns:w14="http://schemas.microsoft.com/office/word/2010/wordml" xmlns:w15="http://schemas.microsoft.com/office/word/2012/wordml" xmlns:w16se="http://schemas.microsoft.com/office/word/2015/wordml/symex" xmlns:wpg="http://schemas.microsoft.com/office/word/2010/wordprocessingGroup" xmlns:wpi="http://schemas.microsoft.com/office/word/2010/wordprocessingInk" xmlns:wne="http://schemas.microsoft.com/office/word/2006/wordml" xmlns:wps="http://schemas.microsoft.com/office/word/2010/wordprocessingShape" mc:Ignorable="w14 w15 w16se wp14">
   <w:endnote w:type="separator" w:id="-1">
     <w:p>
       <w:pPr>
@@ -4103,7 +3976,7 @@
 </file>
 
 <file path=word/footnotes.xml><?xml version="1.0" encoding="utf-8"?>
-<w:footnotes xmlns:wpc="http://schemas.microsoft.com/office/word/2010/wordprocessingCanvas" xmlns:cx="http://schemas.microsoft.com/office/drawing/2014/chartex" xmlns:cx1="http://schemas.microsoft.com/office/drawing/2015/9/8/chartex" xmlns:cx2="http://schemas.microsoft.com/office/drawing/2015/10/21/chartex" xmlns:cx3="http://schemas.microsoft.com/office/drawing/2016/5/9/chartex" xmlns:cx4="http://schemas.microsoft.com/office/drawing/2016/5/10/chartex" xmlns:cx5="http://schemas.microsoft.com/office/drawing/2016/5/11/chartex" xmlns:cx6="http://schemas.microsoft.com/office/drawing/2016/5/12/chartex" xmlns:cx7="http://schemas.microsoft.com/office/drawing/2016/5/13/chartex" xmlns:cx8="http://schemas.microsoft.com/office/drawing/2016/5/14/chartex" xmlns:mc="http://schemas.openxmlformats.org/markup-compatibility/2006" xmlns:aink="http://schemas.microsoft.com/office/drawing/2016/ink" xmlns:am3d="http://schemas.microsoft.com/office/drawing/2017/model3d" xmlns:o="urn:schemas-microsoft-com:office:office" xmlns:r="http://schemas.openxmlformats.org/officeDocument/2006/relationships" xmlns:m="http://schemas.openxmlformats.org/officeDocument/2006/math" xmlns:v="urn:schemas-microsoft-com:vml" xmlns:wp14="http://schemas.microsoft.com/office/word/2010/wordprocessingDrawing" xmlns:wp="http://schemas.openxmlformats.org/drawingml/2006/wordprocessingDrawing" xmlns:w10="urn:schemas-microsoft-com:office:word" xmlns:w="http://schemas.openxmlformats.org/wordprocessingml/2006/main" xmlns:w14="http://schemas.microsoft.com/office/word/2010/wordml" xmlns:w15="http://schemas.microsoft.com/office/word/2012/wordml" xmlns:w16cex="http://schemas.microsoft.com/office/word/2018/wordml/cex" xmlns:w16cid="http://schemas.microsoft.com/office/word/2016/wordml/cid" xmlns:w16="http://schemas.microsoft.com/office/word/2018/wordml" xmlns:w16sdtdh="http://schemas.microsoft.com/office/word/2020/wordml/sdtdatahash" xmlns:w16se="http://schemas.microsoft.com/office/word/2015/wordml/symex" xmlns:wpg="http://schemas.microsoft.com/office/word/2010/wordprocessingGroup" xmlns:wpi="http://schemas.microsoft.com/office/word/2010/wordprocessingInk" xmlns:wne="http://schemas.microsoft.com/office/word/2006/wordml" xmlns:wps="http://schemas.microsoft.com/office/word/2010/wordprocessingShape" mc:Ignorable="w14 w15 w16se w16cid w16 w16cex w16sdtdh wp14">
+<w:footnotes xmlns:wpc="http://schemas.microsoft.com/office/word/2010/wordprocessingCanvas" xmlns:cx="http://schemas.microsoft.com/office/drawing/2014/chartex" xmlns:mc="http://schemas.openxmlformats.org/markup-compatibility/2006" xmlns:o="urn:schemas-microsoft-com:office:office" xmlns:r="http://schemas.openxmlformats.org/officeDocument/2006/relationships" xmlns:m="http://schemas.openxmlformats.org/officeDocument/2006/math" xmlns:v="urn:schemas-microsoft-com:vml" xmlns:wp14="http://schemas.microsoft.com/office/word/2010/wordprocessingDrawing" xmlns:wp="http://schemas.openxmlformats.org/drawingml/2006/wordprocessingDrawing" xmlns:w10="urn:schemas-microsoft-com:office:word" xmlns:w="http://schemas.openxmlformats.org/wordprocessingml/2006/main" xmlns:w14="http://schemas.microsoft.com/office/word/2010/wordml" xmlns:w15="http://schemas.microsoft.com/office/word/2012/wordml" xmlns:w16se="http://schemas.microsoft.com/office/word/2015/wordml/symex" xmlns:wpg="http://schemas.microsoft.com/office/word/2010/wordprocessingGroup" xmlns:wpi="http://schemas.microsoft.com/office/word/2010/wordprocessingInk" xmlns:wne="http://schemas.microsoft.com/office/word/2006/wordml" xmlns:wps="http://schemas.microsoft.com/office/word/2010/wordprocessingShape" mc:Ignorable="w14 w15 w16se wp14">
   <w:footnote w:type="separator" w:id="-1">
     <w:p>
       <w:pPr>
@@ -4128,7 +4001,7 @@
 </file>
 
 <file path=word/styles.xml><?xml version="1.0" encoding="utf-8"?>
-<w:styles xmlns:mc="http://schemas.openxmlformats.org/markup-compatibility/2006" xmlns:r="http://schemas.openxmlformats.org/officeDocument/2006/relationships" xmlns:w="http://schemas.openxmlformats.org/wordprocessingml/2006/main" xmlns:w14="http://schemas.microsoft.com/office/word/2010/wordml" xmlns:w15="http://schemas.microsoft.com/office/word/2012/wordml" xmlns:w16cex="http://schemas.microsoft.com/office/word/2018/wordml/cex" xmlns:w16cid="http://schemas.microsoft.com/office/word/2016/wordml/cid" xmlns:w16="http://schemas.microsoft.com/office/word/2018/wordml" xmlns:w16sdtdh="http://schemas.microsoft.com/office/word/2020/wordml/sdtdatahash" xmlns:w16se="http://schemas.microsoft.com/office/word/2015/wordml/symex" mc:Ignorable="w14 w15 w16se w16cid w16 w16cex w16sdtdh">
+<w:styles xmlns:mc="http://schemas.openxmlformats.org/markup-compatibility/2006" xmlns:r="http://schemas.openxmlformats.org/officeDocument/2006/relationships" xmlns:w="http://schemas.openxmlformats.org/wordprocessingml/2006/main" xmlns:w14="http://schemas.microsoft.com/office/word/2010/wordml" xmlns:w15="http://schemas.microsoft.com/office/word/2012/wordml" xmlns:w16se="http://schemas.microsoft.com/office/word/2015/wordml/symex" mc:Ignorable="w14 w15 w16se">
   <w:docDefaults>
     <w:rPrDefault>
       <w:rPr>
@@ -4144,7 +4017,7 @@
       </w:pPr>
     </w:pPrDefault>
   </w:docDefaults>
-  <w:latentStyles w:defLockedState="0" w:defUIPriority="99" w:defSemiHidden="0" w:defUnhideWhenUsed="0" w:defQFormat="0" w:count="376">
+  <w:latentStyles w:defLockedState="0" w:defUIPriority="99" w:defSemiHidden="0" w:defUnhideWhenUsed="0" w:defQFormat="0" w:count="371">
     <w:lsdException w:name="Normal" w:uiPriority="0" w:qFormat="1"/>
     <w:lsdException w:name="heading 1" w:uiPriority="9" w:qFormat="1"/>
     <w:lsdException w:name="heading 2" w:semiHidden="1" w:uiPriority="9" w:unhideWhenUsed="1" w:qFormat="1"/>
@@ -4516,11 +4389,6 @@
     <w:lsdException w:name="List Table 5 Dark Accent 6" w:uiPriority="50"/>
     <w:lsdException w:name="List Table 6 Colorful Accent 6" w:uiPriority="51"/>
     <w:lsdException w:name="List Table 7 Colorful Accent 6" w:uiPriority="52"/>
-    <w:lsdException w:name="Mention" w:semiHidden="1" w:unhideWhenUsed="1"/>
-    <w:lsdException w:name="Smart Hyperlink" w:semiHidden="1" w:unhideWhenUsed="1"/>
-    <w:lsdException w:name="Hashtag" w:semiHidden="1" w:unhideWhenUsed="1"/>
-    <w:lsdException w:name="Unresolved Mention" w:semiHidden="1" w:unhideWhenUsed="1"/>
-    <w:lsdException w:name="Smart Link" w:semiHidden="1" w:unhideWhenUsed="1"/>
   </w:latentStyles>
   <w:style w:type="paragraph" w:default="1" w:styleId="a">
     <w:name w:val="Normal"/>
@@ -16238,6 +16106,34 @@
         <w:vAlign w:val="bottom"/>
       </w:tcPr>
     </w:tblStylePr>
+  </w:style>
+  <w:style w:type="paragraph" w:styleId="afc">
+    <w:name w:val="Normal (Web)"/>
+    <w:basedOn w:val="a"/>
+    <w:uiPriority w:val="99"/>
+    <w:semiHidden/>
+    <w:unhideWhenUsed/>
+    <w:rsid w:val="0055542C"/>
+    <w:pPr>
+      <w:spacing w:before="100" w:beforeAutospacing="1" w:after="100" w:afterAutospacing="1" w:line="240" w:lineRule="auto"/>
+    </w:pPr>
+    <w:rPr>
+      <w:rFonts w:ascii="Times New Roman" w:eastAsia="Times New Roman" w:hAnsi="Times New Roman"/>
+      <w:sz w:val="24"/>
+      <w:szCs w:val="24"/>
+      <w:lang w:eastAsia="ru-RU"/>
+    </w:rPr>
+  </w:style>
+  <w:style w:type="character" w:styleId="afd">
+    <w:name w:val="Strong"/>
+    <w:basedOn w:val="a0"/>
+    <w:uiPriority w:val="22"/>
+    <w:qFormat/>
+    <w:rsid w:val="0055542C"/>
+    <w:rPr>
+      <w:b/>
+      <w:bCs/>
+    </w:rPr>
   </w:style>
 </w:styles>
 </file>

</xml_diff>